<commit_message>
Trello links toegevoegd bij het GDD
</commit_message>
<xml_diff>
--- a/Conceptfase/TurnBased/1_GDD_Turnbased_Stamgroep_B.docx
+++ b/Conceptfase/TurnBased/1_GDD_Turnbased_Stamgroep_B.docx
@@ -1557,12 +1557,7 @@
       <w:bookmarkEnd w:id="0"/>
     </w:p>
     <w:p>
-      <w:pPr>
-        <w:rPr>
-          <w:i w:val="1"/>
-          <w:iCs w:val="1"/>
-        </w:rPr>
-      </w:pPr>
+      <w:pPr/>
       <w:r>
         <w:rPr>
           <w:i w:val="1"/>
@@ -1723,6 +1718,86 @@
           <w:iCs w:val="1"/>
         </w:rPr>
         <w:t>]</w:t>
+      </w:r>
+    </w:p>
+    <w:p>
+      <w:pPr>
+        <w:rPr>
+          <w:i w:val="1"/>
+          <w:iCs w:val="1"/>
+        </w:rPr>
+      </w:pPr>
+    </w:p>
+    <w:p>
+      <w:pPr/>
+      <w:hyperlink r:id="R3dfe464f465a4b5a">
+        <w:r>
+          <w:rPr>
+            <w:rStyle w:val="Hyperlink"/>
+            <w:i w:val="1"/>
+            <w:iCs w:val="1"/>
+          </w:rPr>
+          <w:t>https://trello.com/invite/b/6abf9ff4c3de199e0ee4620f/ATTI2b7c81d8b7cfc6911ba4e2c2160549a706F0E531/turn-based-concept</w:t>
+        </w:r>
+      </w:hyperlink>
+    </w:p>
+    <w:p>
+      <w:pPr>
+        <w:rPr>
+          <w:i w:val="1"/>
+          <w:iCs w:val="1"/>
+        </w:rPr>
+      </w:pPr>
+    </w:p>
+    <w:p>
+      <w:pPr>
+        <w:rPr>
+          <w:i w:val="1"/>
+          <w:iCs w:val="1"/>
+        </w:rPr>
+      </w:pPr>
+      <w:r>
+        <w:drawing>
+          <wp:inline wp14:editId="4BA52D52" wp14:anchorId="2360D0F7">
+            <wp:extent cx="5762625" cy="1943100"/>
+            <wp:effectExtent l="0" t="0" r="0" b="0"/>
+            <wp:docPr id="1891808359" name="drawing"/>
+            <wp:cNvGraphicFramePr>
+              <a:graphicFrameLocks noChangeAspect="1"/>
+            </wp:cNvGraphicFramePr>
+            <a:graphic>
+              <a:graphicData xmlns:a="http://schemas.openxmlformats.org/drawingml/2006/main" uri="http://schemas.openxmlformats.org/drawingml/2006/picture">
+                <pic:pic xmlns:pic="http://schemas.openxmlformats.org/drawingml/2006/picture">
+                  <pic:nvPicPr>
+                    <pic:cNvPr id="1891808359" name="Picture 1891808359"/>
+                    <pic:cNvPicPr/>
+                  </pic:nvPicPr>
+                  <pic:blipFill>
+                    <a:blip xmlns:r="http://schemas.openxmlformats.org/officeDocument/2006/relationships" r:embed="rId1133931448">
+                      <a:extLst>
+                        <a:ext uri="{28A0092B-C50C-407E-A947-70E740481C1C}">
+                          <a14:useLocalDpi xmlns:a14="http://schemas.microsoft.com/office/drawing/2010/main"/>
+                        </a:ext>
+                      </a:extLst>
+                    </a:blip>
+                    <a:stretch>
+                      <a:fillRect/>
+                    </a:stretch>
+                  </pic:blipFill>
+                  <pic:spPr>
+                    <a:xfrm>
+                      <a:off x="0" y="0"/>
+                      <a:ext cx="5762625" cy="1943100"/>
+                    </a:xfrm>
+                    <a:prstGeom prst="rect">
+                      <a:avLst/>
+                    </a:prstGeom>
+                  </pic:spPr>
+                </pic:pic>
+              </a:graphicData>
+            </a:graphic>
+          </wp:inline>
+        </w:drawing>
       </w:r>
       <w:r>
         <w:rPr>

</xml_diff>